<commit_message>
feat: add about/examples guides and OTA workflow updates
</commit_message>
<xml_diff>
--- a/docs/patents/patent-draft/form 18 (2).docx
+++ b/docs/patents/patent-draft/form 18 (2).docx
@@ -123,7 +123,6 @@
               <w:t>*Seesection11Bandrule20(4)(ii),24B(1)(</w:t>
             </w:r>
             <w:proofErr w:type="spellStart"/>
-            <w:proofErr w:type="gramStart"/>
             <w:r>
               <w:rPr>
                 <w:b/>
@@ -139,7 +138,6 @@
               </w:rPr>
               <w:t>)+</w:t>
             </w:r>
-            <w:proofErr w:type="gramEnd"/>
           </w:p>
         </w:tc>
         <w:tc>
@@ -179,7 +177,6 @@
               <w:ind w:left="115"/>
             </w:pPr>
             <w:proofErr w:type="spellStart"/>
-            <w:proofErr w:type="gramStart"/>
             <w:r>
               <w:rPr>
                 <w:spacing w:val="-2"/>
@@ -187,7 +184,6 @@
               <w:t>RQ.No</w:t>
             </w:r>
             <w:proofErr w:type="spellEnd"/>
-            <w:proofErr w:type="gramEnd"/>
             <w:r>
               <w:rPr>
                 <w:spacing w:val="-2"/>
@@ -454,10 +450,6 @@
               <w:pStyle w:val="TableParagraph"/>
               <w:spacing w:before="64"/>
               <w:ind w:right="141"/>
-              <w:rPr>
-                <w:b/>
-                <w:bCs/>
-              </w:rPr>
             </w:pPr>
             <w:r>
               <w:rPr>
@@ -501,20 +493,44 @@
             <w:r>
               <w:t>inventiontitled</w:t>
             </w:r>
-            <w:r>
-              <w:rPr>
-                <w:b/>
-                <w:bCs/>
+            <w:proofErr w:type="spellEnd"/>
+            <w:r>
+              <w:t xml:space="preserve"> </w:t>
+            </w:r>
+            <w:r>
+              <w:rPr>
+                <w:rFonts w:ascii="Times New Roman" w:hAnsi="Times New Roman" w:cs="Times New Roman"/>
+                <w:sz w:val="24"/>
+                <w:szCs w:val="24"/>
               </w:rPr>
               <w:t>SECURE</w:t>
             </w:r>
-            <w:proofErr w:type="spellEnd"/>
-            <w:r>
-              <w:rPr>
-                <w:b/>
-                <w:bCs/>
-              </w:rPr>
-              <w:t xml:space="preserve"> </w:t>
+            <w:r>
+              <w:rPr>
+                <w:rFonts w:ascii="Times New Roman" w:hAnsi="Times New Roman" w:cs="Times New Roman"/>
+                <w:sz w:val="24"/>
+                <w:szCs w:val="24"/>
+              </w:rPr>
+              <w:t xml:space="preserve"> </w:t>
+            </w:r>
+            <w:r>
+              <w:rPr>
+                <w:rFonts w:ascii="Times New Roman" w:hAnsi="Times New Roman" w:cs="Times New Roman"/>
+                <w:sz w:val="24"/>
+                <w:szCs w:val="24"/>
+              </w:rPr>
+              <w:t>HETEROGENEOUS OTA UPDATE MECHANISM</w:t>
+            </w:r>
+            <w:r>
+              <w:rPr>
+                <w:rFonts w:ascii="Times New Roman" w:hAnsi="Times New Roman" w:cs="Times New Roman"/>
+                <w:sz w:val="24"/>
+                <w:szCs w:val="24"/>
+              </w:rPr>
+              <w:t xml:space="preserve"> </w:t>
+            </w:r>
+            <w:r>
+              <w:t>shallbeexaminedUndersections12and13ofthe</w:t>
             </w:r>
           </w:p>
           <w:p>
@@ -522,43 +538,6 @@
               <w:pStyle w:val="TableParagraph"/>
               <w:spacing w:before="64"/>
               <w:ind w:right="141"/>
-            </w:pPr>
-            <w:r>
-              <w:rPr>
-                <w:b/>
-                <w:bCs/>
-              </w:rPr>
-              <w:t>HETEROGENEOUS OTA UPDATE</w:t>
-            </w:r>
-            <w:r>
-              <w:rPr>
-                <w:b/>
-                <w:bCs/>
-              </w:rPr>
-              <w:t xml:space="preserve"> </w:t>
-            </w:r>
-            <w:r>
-              <w:rPr>
-                <w:b/>
-                <w:bCs/>
-              </w:rPr>
-              <w:t>MECHANISM</w:t>
-            </w:r>
-            <w:r>
-              <w:t>shallbeexamined</w:t>
-            </w:r>
-            <w:r>
-              <w:t>U</w:t>
-            </w:r>
-            <w:r>
-              <w:t>ndersections12and13ofthe</w:t>
-            </w:r>
-          </w:p>
-          <w:p>
-            <w:pPr>
-              <w:pStyle w:val="TableParagraph"/>
-              <w:spacing w:before="64"/>
-              <w:ind w:right="141"/>
               <w:rPr>
                 <w:b/>
                 <w:bCs/>
@@ -573,6 +552,9 @@
               <w:pStyle w:val="TableParagraph"/>
               <w:spacing w:before="10" w:line="235" w:lineRule="auto"/>
               <w:ind w:firstLine="4115"/>
+              <w:rPr>
+                <w:spacing w:val="-6"/>
+              </w:rPr>
             </w:pPr>
             <w:r>
               <w:rPr>
@@ -580,39 +562,164 @@
               </w:rPr>
               <w:t xml:space="preserve">Or </w:t>
             </w:r>
-            <w:r>
-              <w:rPr>
-                <w:spacing w:val="-2"/>
-              </w:rPr>
-              <w:t>I/</w:t>
+          </w:p>
+          <w:p>
+            <w:pPr>
+              <w:pStyle w:val="TableParagraph"/>
+              <w:spacing w:before="10" w:line="235" w:lineRule="auto"/>
+              <w:ind w:left="366" w:firstLine="141"/>
+            </w:pPr>
+            <w:r>
+              <w:rPr>
+                <w:spacing w:val="-2"/>
+              </w:rPr>
+              <w:t>I/We</w:t>
+            </w:r>
+            <w:r>
+              <w:rPr>
+                <w:spacing w:val="-2"/>
+              </w:rPr>
+              <w:t xml:space="preserve"> </w:t>
             </w:r>
             <w:proofErr w:type="spellStart"/>
             <w:r>
               <w:rPr>
                 <w:spacing w:val="-2"/>
               </w:rPr>
-              <w:t>Weherebymakeanexpressrequestthatmy</w:t>
+              <w:t>here</w:t>
+            </w:r>
+            <w:r>
+              <w:rPr>
+                <w:spacing w:val="-2"/>
+              </w:rPr>
+              <w:t xml:space="preserve"> </w:t>
+            </w:r>
+            <w:r>
+              <w:rPr>
+                <w:spacing w:val="-2"/>
+              </w:rPr>
+              <w:t>by</w:t>
             </w:r>
             <w:proofErr w:type="spellEnd"/>
             <w:r>
               <w:rPr>
                 <w:spacing w:val="-2"/>
               </w:rPr>
-              <w:t>/</w:t>
-            </w:r>
-            <w:proofErr w:type="spellStart"/>
-            <w:r>
-              <w:rPr>
-                <w:spacing w:val="-2"/>
-              </w:rPr>
-              <w:t>ourapplicationforpatentno</w:t>
-            </w:r>
-            <w:proofErr w:type="spellEnd"/>
-            <w:r>
-              <w:rPr>
-                <w:spacing w:val="-2"/>
-              </w:rPr>
-              <w:t>.</w:t>
+              <w:t xml:space="preserve"> </w:t>
+            </w:r>
+            <w:r>
+              <w:rPr>
+                <w:spacing w:val="-2"/>
+              </w:rPr>
+              <w:t>make</w:t>
+            </w:r>
+            <w:r>
+              <w:rPr>
+                <w:spacing w:val="-2"/>
+              </w:rPr>
+              <w:t xml:space="preserve"> </w:t>
+            </w:r>
+            <w:r>
+              <w:rPr>
+                <w:spacing w:val="-2"/>
+              </w:rPr>
+              <w:t>an</w:t>
+            </w:r>
+            <w:r>
+              <w:rPr>
+                <w:spacing w:val="-2"/>
+              </w:rPr>
+              <w:t xml:space="preserve"> </w:t>
+            </w:r>
+            <w:r>
+              <w:rPr>
+                <w:spacing w:val="-2"/>
+              </w:rPr>
+              <w:t>express</w:t>
+            </w:r>
+            <w:r>
+              <w:rPr>
+                <w:spacing w:val="-2"/>
+              </w:rPr>
+              <w:t xml:space="preserve"> </w:t>
+            </w:r>
+            <w:r>
+              <w:rPr>
+                <w:spacing w:val="-2"/>
+              </w:rPr>
+              <w:t>request</w:t>
+            </w:r>
+            <w:r>
+              <w:rPr>
+                <w:spacing w:val="-2"/>
+              </w:rPr>
+              <w:t xml:space="preserve"> </w:t>
+            </w:r>
+            <w:r>
+              <w:rPr>
+                <w:spacing w:val="-2"/>
+              </w:rPr>
+              <w:t>that</w:t>
+            </w:r>
+            <w:r>
+              <w:rPr>
+                <w:spacing w:val="-2"/>
+              </w:rPr>
+              <w:t xml:space="preserve"> </w:t>
+            </w:r>
+            <w:r>
+              <w:rPr>
+                <w:spacing w:val="-2"/>
+              </w:rPr>
+              <w:t>my/our</w:t>
+            </w:r>
+            <w:r>
+              <w:rPr>
+                <w:spacing w:val="-2"/>
+              </w:rPr>
+              <w:t xml:space="preserve"> </w:t>
+            </w:r>
+            <w:r>
+              <w:rPr>
+                <w:spacing w:val="-2"/>
+              </w:rPr>
+              <w:t>application</w:t>
+            </w:r>
+            <w:r>
+              <w:rPr>
+                <w:spacing w:val="-2"/>
+              </w:rPr>
+              <w:t xml:space="preserve"> </w:t>
+            </w:r>
+            <w:r>
+              <w:rPr>
+                <w:spacing w:val="-2"/>
+              </w:rPr>
+              <w:t>for</w:t>
+            </w:r>
+            <w:r>
+              <w:rPr>
+                <w:spacing w:val="-2"/>
+              </w:rPr>
+              <w:t xml:space="preserve"> </w:t>
+            </w:r>
+            <w:r>
+              <w:rPr>
+                <w:spacing w:val="-2"/>
+              </w:rPr>
+              <w:t>patent</w:t>
+            </w:r>
+            <w:r>
+              <w:rPr>
+                <w:spacing w:val="-2"/>
+              </w:rPr>
+              <w:t xml:space="preserve"> </w:t>
+            </w:r>
+            <w:r>
+              <w:rPr>
+                <w:spacing w:val="-2"/>
+              </w:rPr>
+              <w:t>no.</w:t>
             </w:r>
           </w:p>
           <w:p>
@@ -624,7 +731,10 @@
                 <w:tab w:val="left" w:pos="5884"/>
               </w:tabs>
               <w:spacing w:before="2"/>
-              <w:ind w:right="2638"/>
+              <w:ind w:left="366" w:right="2638" w:firstLine="109"/>
+              <w:rPr>
+                <w:spacing w:val="-2"/>
+              </w:rPr>
             </w:pPr>
             <w:r>
               <w:rPr>
@@ -716,7 +826,7 @@
                 </mc:Choice>
                 <mc:Fallback>
                   <w:pict>
-                    <v:group w14:anchorId="62D07088" id="Group 1" o:spid="_x0000_s1026" style="position:absolute;margin-left:23.5pt;margin-top:8.45pt;width:422.1pt;height:.7pt;z-index:-15778816;mso-wrap-distance-left:0;mso-wrap-distance-right:0" coordsize="53606,88" o:gfxdata="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">
+                    <v:group w14:anchorId="73C39A29" id="Group 1" o:spid="_x0000_s1026" style="position:absolute;margin-left:23.5pt;margin-top:8.45pt;width:422.1pt;height:.7pt;z-index:-15778816;mso-wrap-distance-left:0;mso-wrap-distance-right:0" coordsize="53606,88" o:gfxdata="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">
                       <v:shape id="Graphic 2" o:spid="_x0000_s1027" style="position:absolute;width:53606;height:88;visibility:visible;mso-wrap-style:square;v-text-anchor:top" coordsize="5360670,8890" o:gfxdata="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" path="m5360670,l,,,8889r5360670,l5360670,xe" fillcolor="black" stroked="f">
                         <v:path arrowok="t"/>
                       </v:shape>
@@ -725,80 +835,103 @@
                 </mc:Fallback>
               </mc:AlternateContent>
             </w:r>
+          </w:p>
+          <w:p>
+            <w:pPr>
+              <w:pStyle w:val="TableParagraph"/>
+              <w:tabs>
+                <w:tab w:val="left" w:pos="2136"/>
+                <w:tab w:val="left" w:pos="5838"/>
+                <w:tab w:val="left" w:pos="5884"/>
+              </w:tabs>
+              <w:spacing w:before="2"/>
+              <w:ind w:left="366" w:right="2638" w:firstLine="109"/>
+              <w:rPr>
+                <w:spacing w:val="-2"/>
+              </w:rPr>
+            </w:pPr>
+            <w:proofErr w:type="spellStart"/>
+            <w:r>
+              <w:rPr>
+                <w:spacing w:val="-2"/>
+              </w:rPr>
+              <w:t>F</w:t>
+            </w:r>
+            <w:r>
+              <w:rPr>
+                <w:spacing w:val="-2"/>
+              </w:rPr>
+              <w:t>iledon</w:t>
+            </w:r>
+            <w:proofErr w:type="spellEnd"/>
             <w:r>
               <w:rPr>
                 <w:u w:val="single"/>
               </w:rPr>
-              <w:tab/>
+              <w:t xml:space="preserve"> </w:t>
+            </w:r>
+            <w:r>
+              <w:rPr>
+                <w:spacing w:val="-2"/>
+              </w:rPr>
+              <w:t>based on</w:t>
+            </w:r>
+            <w:r>
+              <w:rPr>
+                <w:spacing w:val="-2"/>
+              </w:rPr>
+              <w:t xml:space="preserve"> </w:t>
+            </w:r>
+            <w:r>
+              <w:rPr>
+                <w:spacing w:val="-2"/>
+              </w:rPr>
+              <w:t>Patent</w:t>
+            </w:r>
+            <w:r>
+              <w:rPr>
+                <w:spacing w:val="-2"/>
+              </w:rPr>
+              <w:t xml:space="preserve"> </w:t>
             </w:r>
             <w:proofErr w:type="spellStart"/>
             <w:r>
               <w:rPr>
                 <w:spacing w:val="-2"/>
               </w:rPr>
-              <w:t>filedon</w:t>
+              <w:t>CooperationTreaty</w:t>
             </w:r>
             <w:proofErr w:type="spellEnd"/>
             <w:r>
               <w:rPr>
-                <w:u w:val="single"/>
-              </w:rPr>
-              <w:tab/>
-            </w:r>
-            <w:r>
-              <w:rPr>
-                <w:spacing w:val="-2"/>
-              </w:rPr>
-              <w:t xml:space="preserve">based </w:t>
-            </w:r>
-            <w:proofErr w:type="spellStart"/>
-            <w:proofErr w:type="gramStart"/>
-            <w:r>
-              <w:rPr>
-                <w:spacing w:val="-2"/>
-              </w:rPr>
-              <w:t>onPatentCooperationTreaty</w:t>
-            </w:r>
-            <w:proofErr w:type="spellEnd"/>
-            <w:r>
-              <w:rPr>
-                <w:spacing w:val="-2"/>
-              </w:rPr>
-              <w:t>(</w:t>
-            </w:r>
-            <w:proofErr w:type="gramEnd"/>
-            <w:r>
-              <w:rPr>
-                <w:spacing w:val="-2"/>
-              </w:rPr>
-              <w:t>PCT)</w:t>
-            </w:r>
-            <w:proofErr w:type="spellStart"/>
-            <w:r>
-              <w:rPr>
-                <w:spacing w:val="-2"/>
-              </w:rPr>
-              <w:t>applicationno</w:t>
-            </w:r>
-            <w:proofErr w:type="spellEnd"/>
-            <w:r>
-              <w:rPr>
-                <w:spacing w:val="-2"/>
-              </w:rPr>
-              <w:t>.</w:t>
-            </w:r>
-            <w:r>
-              <w:rPr>
-                <w:u w:val="single"/>
-              </w:rPr>
-              <w:tab/>
-            </w:r>
-            <w:r>
-              <w:rPr>
-                <w:u w:val="single"/>
-              </w:rPr>
-              <w:tab/>
-            </w:r>
+                <w:spacing w:val="-2"/>
+              </w:rPr>
+              <w:t>(PCT)application</w:t>
+            </w:r>
+            <w:r>
+              <w:rPr>
+                <w:spacing w:val="-2"/>
+              </w:rPr>
+              <w:t xml:space="preserve"> </w:t>
+            </w:r>
+            <w:r>
+              <w:rPr>
+                <w:spacing w:val="-2"/>
+              </w:rPr>
+              <w:t>no.</w:t>
+            </w:r>
+          </w:p>
+          <w:p>
+            <w:pPr>
+              <w:pStyle w:val="TableParagraph"/>
+              <w:tabs>
+                <w:tab w:val="left" w:pos="2136"/>
+                <w:tab w:val="left" w:pos="5838"/>
+                <w:tab w:val="left" w:pos="5884"/>
+              </w:tabs>
+              <w:spacing w:before="2"/>
+              <w:ind w:right="2638"/>
+            </w:pPr>
           </w:p>
           <w:p>
             <w:pPr>
@@ -808,6 +941,9 @@
                 <w:tab w:val="left" w:pos="5884"/>
               </w:tabs>
               <w:spacing w:before="1" w:line="266" w:lineRule="exact"/>
+              <w:rPr>
+                <w:spacing w:val="-2"/>
+              </w:rPr>
             </w:pPr>
             <w:r>
               <w:rPr>
@@ -899,7 +1035,7 @@
                 </mc:Choice>
                 <mc:Fallback>
                   <w:pict>
-                    <v:group w14:anchorId="64071715" id="Group 3" o:spid="_x0000_s1026" style="position:absolute;margin-left:23.5pt;margin-top:-5.05pt;width:422.1pt;height:.7pt;z-index:-15778304;mso-wrap-distance-left:0;mso-wrap-distance-right:0" coordsize="53606,88" o:gfxdata="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">
+                    <v:group w14:anchorId="1A9AC6DC" id="Group 3" o:spid="_x0000_s1026" style="position:absolute;margin-left:23.5pt;margin-top:-5.05pt;width:422.1pt;height:.7pt;z-index:-15778304;mso-wrap-distance-left:0;mso-wrap-distance-right:0" coordsize="53606,88" o:gfxdata="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">
                       <v:shape id="Graphic 4" o:spid="_x0000_s1027" style="position:absolute;width:53606;height:88;visibility:visible;mso-wrap-style:square;v-text-anchor:top" coordsize="5360670,8890" o:gfxdata="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" path="m5360670,l,,,8890r5360670,l5360670,xe" fillcolor="black" stroked="f">
                         <v:path arrowok="t"/>
                       </v:shape>
@@ -910,32 +1046,10 @@
             </w:r>
             <w:r>
               <w:rPr>
-                <w:u w:val="single"/>
-              </w:rPr>
-              <w:tab/>
-            </w:r>
-            <w:r>
-              <w:rPr>
                 <w:spacing w:val="-4"/>
               </w:rPr>
               <w:t>dated</w:t>
             </w:r>
-            <w:r>
-              <w:rPr>
-                <w:u w:val="single"/>
-              </w:rPr>
-              <w:tab/>
-            </w:r>
-          </w:p>
-          <w:p>
-            <w:pPr>
-              <w:pStyle w:val="TableParagraph"/>
-              <w:tabs>
-                <w:tab w:val="left" w:pos="2136"/>
-                <w:tab w:val="left" w:leader="underscore" w:pos="5838"/>
-              </w:tabs>
-              <w:spacing w:line="266" w:lineRule="exact"/>
-            </w:pPr>
             <w:r>
               <w:rPr>
                 <w:noProof/>
@@ -1026,7 +1140,7 @@
                 </mc:Choice>
                 <mc:Fallback>
                   <w:pict>
-                    <v:group w14:anchorId="7F51C5A6" id="Group 5" o:spid="_x0000_s1026" style="position:absolute;margin-left:23.5pt;margin-top:-4.95pt;width:422.1pt;height:.7pt;z-index:-15777792;mso-wrap-distance-left:0;mso-wrap-distance-right:0" coordsize="53606,88" o:gfxdata="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">
+                    <v:group w14:anchorId="22D1B8D8" id="Group 5" o:spid="_x0000_s1026" style="position:absolute;margin-left:23.5pt;margin-top:-4.95pt;width:422.1pt;height:.7pt;z-index:-15777792;mso-wrap-distance-left:0;mso-wrap-distance-right:0" coordsize="53606,88" o:gfxdata="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">
                       <v:shape id="Graphic 6" o:spid="_x0000_s1027" style="position:absolute;width:53606;height:88;visibility:visible;mso-wrap-style:square;v-text-anchor:top" coordsize="5360670,8890" o:gfxdata="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" path="m5360670,l,,,8889r5360670,l5360670,xe" fillcolor="black" stroked="f">
                         <v:path arrowok="t"/>
                       </v:shape>
@@ -1037,32 +1151,128 @@
             </w:r>
             <w:r>
               <w:rPr>
-                <w:u w:val="single"/>
-              </w:rPr>
-              <w:tab/>
-            </w:r>
-            <w:proofErr w:type="spellStart"/>
-            <w:r>
-              <w:rPr>
-                <w:spacing w:val="-2"/>
-              </w:rPr>
-              <w:t>madeincountry</w:t>
-            </w:r>
-            <w:proofErr w:type="spellEnd"/>
-            <w:r>
-              <w:tab/>
-            </w:r>
-            <w:r>
-              <w:rPr>
-                <w:spacing w:val="-2"/>
-              </w:rPr>
-              <w:t>shallbeexaminedundersections12</w:t>
+                <w:spacing w:val="-4"/>
+              </w:rPr>
+              <w:t xml:space="preserve"> </w:t>
+            </w:r>
+            <w:r>
+              <w:rPr>
+                <w:spacing w:val="-2"/>
+              </w:rPr>
+              <w:t>made</w:t>
+            </w:r>
+            <w:r>
+              <w:rPr>
+                <w:spacing w:val="-2"/>
+              </w:rPr>
+              <w:t xml:space="preserve"> </w:t>
+            </w:r>
+            <w:r>
+              <w:rPr>
+                <w:spacing w:val="-2"/>
+              </w:rPr>
+              <w:t>in</w:t>
+            </w:r>
+            <w:r>
+              <w:rPr>
+                <w:spacing w:val="-2"/>
+              </w:rPr>
+              <w:t xml:space="preserve"> </w:t>
+            </w:r>
+            <w:r>
+              <w:rPr>
+                <w:spacing w:val="-2"/>
+              </w:rPr>
+              <w:t>country</w:t>
+            </w:r>
+            <w:r>
+              <w:rPr>
+                <w:spacing w:val="-2"/>
+              </w:rPr>
+              <w:t xml:space="preserve"> </w:t>
+            </w:r>
+            <w:r>
+              <w:rPr>
+                <w:spacing w:val="-2"/>
+              </w:rPr>
+              <w:t>shall</w:t>
+            </w:r>
+            <w:r>
+              <w:rPr>
+                <w:spacing w:val="-2"/>
+              </w:rPr>
+              <w:t xml:space="preserve"> </w:t>
+            </w:r>
+            <w:r>
+              <w:rPr>
+                <w:spacing w:val="-2"/>
+              </w:rPr>
+              <w:t>be</w:t>
+            </w:r>
+            <w:r>
+              <w:rPr>
+                <w:spacing w:val="-2"/>
+              </w:rPr>
+              <w:t xml:space="preserve"> </w:t>
+            </w:r>
+            <w:r>
+              <w:rPr>
+                <w:spacing w:val="-2"/>
+              </w:rPr>
+              <w:t>examined</w:t>
+            </w:r>
+            <w:r>
+              <w:rPr>
+                <w:spacing w:val="-2"/>
+              </w:rPr>
+              <w:t xml:space="preserve"> </w:t>
+            </w:r>
+            <w:r>
+              <w:rPr>
+                <w:spacing w:val="-2"/>
+              </w:rPr>
+              <w:t>under</w:t>
+            </w:r>
+            <w:r>
+              <w:rPr>
+                <w:spacing w:val="-2"/>
+              </w:rPr>
+              <w:t xml:space="preserve"> </w:t>
+            </w:r>
+            <w:r>
+              <w:rPr>
+                <w:spacing w:val="-2"/>
+              </w:rPr>
+              <w:t>sections</w:t>
+            </w:r>
+            <w:r>
+              <w:rPr>
+                <w:spacing w:val="-2"/>
+              </w:rPr>
+              <w:t xml:space="preserve"> </w:t>
+            </w:r>
+            <w:r>
+              <w:rPr>
+                <w:spacing w:val="-2"/>
+              </w:rPr>
+              <w:t>12</w:t>
             </w:r>
           </w:p>
           <w:p>
             <w:pPr>
               <w:pStyle w:val="TableParagraph"/>
               <w:spacing w:line="270" w:lineRule="atLeast"/>
+              <w:ind w:left="0"/>
+              <w:rPr>
+                <w:spacing w:val="-2"/>
+              </w:rPr>
+            </w:pPr>
+          </w:p>
+          <w:p>
+            <w:pPr>
+              <w:pStyle w:val="TableParagraph"/>
+              <w:spacing w:line="270" w:lineRule="atLeast"/>
+              <w:ind w:left="507"/>
             </w:pPr>
             <w:r>
               <w:rPr>
@@ -1154,7 +1364,7 @@
                 </mc:Choice>
                 <mc:Fallback>
                   <w:pict>
-                    <v:group w14:anchorId="7DF0806E" id="Group 7" o:spid="_x0000_s1026" style="position:absolute;margin-left:23.5pt;margin-top:-4.75pt;width:422.1pt;height:.7pt;z-index:-15777280;mso-wrap-distance-left:0;mso-wrap-distance-right:0" coordsize="53606,88" o:gfxdata="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">
+                    <v:group w14:anchorId="657BB721" id="Group 7" o:spid="_x0000_s1026" style="position:absolute;margin-left:23.5pt;margin-top:-4.75pt;width:422.1pt;height:.7pt;z-index:-15777280;mso-wrap-distance-left:0;mso-wrap-distance-right:0" coordsize="53606,88" o:gfxdata="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">
                       <v:shape id="Graphic 8" o:spid="_x0000_s1027" style="position:absolute;width:53606;height:88;visibility:visible;mso-wrap-style:square;v-text-anchor:top" coordsize="5360670,8890" o:gfxdata="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" path="m5360670,l,,,8889r5360670,l5360670,xe" fillcolor="black" stroked="f">
                         <v:path arrowok="t"/>
                       </v:shape>
@@ -1299,20 +1509,10 @@
               <w:t xml:space="preserve"> </w:t>
             </w:r>
             <w:r>
-              <w:t xml:space="preserve">specified </w:t>
-            </w:r>
-            <w:r>
-              <w:rPr>
-                <w:spacing w:val="-2"/>
-              </w:rPr>
-              <w:t>in</w:t>
-            </w:r>
-            <w:r>
-              <w:rPr>
-                <w:strike/>
-                <w:spacing w:val="-2"/>
-              </w:rPr>
-              <w:t>rule20(4)(ii).</w:t>
+              <w:t>specified</w:t>
+            </w:r>
+            <w:r>
+              <w:t xml:space="preserve"> in rule 20(4)(ii).</w:t>
             </w:r>
           </w:p>
         </w:tc>
@@ -1332,6 +1532,7 @@
               <w:spacing w:before="55"/>
               <w:rPr>
                 <w:b/>
+                <w:spacing w:val="-2"/>
               </w:rPr>
             </w:pPr>
             <w:r>
@@ -1339,7 +1540,175 @@
                 <w:b/>
                 <w:spacing w:val="-2"/>
               </w:rPr>
-              <w:t>3.Statementincaseofrequestforexaminationmadebyanyotherinterestedperson</w:t>
+              <w:t>3.Statement</w:t>
+            </w:r>
+            <w:r>
+              <w:rPr>
+                <w:b/>
+                <w:spacing w:val="-2"/>
+              </w:rPr>
+              <w:t xml:space="preserve"> </w:t>
+            </w:r>
+            <w:r>
+              <w:rPr>
+                <w:b/>
+                <w:spacing w:val="-2"/>
+              </w:rPr>
+              <w:t>in</w:t>
+            </w:r>
+            <w:r>
+              <w:rPr>
+                <w:b/>
+                <w:spacing w:val="-2"/>
+              </w:rPr>
+              <w:t xml:space="preserve"> </w:t>
+            </w:r>
+            <w:r>
+              <w:rPr>
+                <w:b/>
+                <w:spacing w:val="-2"/>
+              </w:rPr>
+              <w:t>case</w:t>
+            </w:r>
+            <w:r>
+              <w:rPr>
+                <w:b/>
+                <w:spacing w:val="-2"/>
+              </w:rPr>
+              <w:t xml:space="preserve"> </w:t>
+            </w:r>
+            <w:r>
+              <w:rPr>
+                <w:b/>
+                <w:spacing w:val="-2"/>
+              </w:rPr>
+              <w:t>of</w:t>
+            </w:r>
+            <w:r>
+              <w:rPr>
+                <w:b/>
+                <w:spacing w:val="-2"/>
+              </w:rPr>
+              <w:t xml:space="preserve"> </w:t>
+            </w:r>
+            <w:r>
+              <w:rPr>
+                <w:b/>
+                <w:spacing w:val="-2"/>
+              </w:rPr>
+              <w:t>request</w:t>
+            </w:r>
+            <w:r>
+              <w:rPr>
+                <w:b/>
+                <w:spacing w:val="-2"/>
+              </w:rPr>
+              <w:t xml:space="preserve"> </w:t>
+            </w:r>
+            <w:r>
+              <w:rPr>
+                <w:b/>
+                <w:spacing w:val="-2"/>
+              </w:rPr>
+              <w:t>for</w:t>
+            </w:r>
+            <w:r>
+              <w:rPr>
+                <w:b/>
+                <w:spacing w:val="-2"/>
+              </w:rPr>
+              <w:t xml:space="preserve"> </w:t>
+            </w:r>
+            <w:r>
+              <w:rPr>
+                <w:b/>
+                <w:spacing w:val="-2"/>
+              </w:rPr>
+              <w:t>examination</w:t>
+            </w:r>
+            <w:r>
+              <w:rPr>
+                <w:b/>
+                <w:spacing w:val="-2"/>
+              </w:rPr>
+              <w:t xml:space="preserve"> </w:t>
+            </w:r>
+            <w:r>
+              <w:rPr>
+                <w:b/>
+                <w:spacing w:val="-2"/>
+              </w:rPr>
+              <w:t>made</w:t>
+            </w:r>
+            <w:r>
+              <w:rPr>
+                <w:b/>
+                <w:spacing w:val="-2"/>
+              </w:rPr>
+              <w:t xml:space="preserve"> </w:t>
+            </w:r>
+            <w:r>
+              <w:rPr>
+                <w:b/>
+                <w:spacing w:val="-2"/>
+              </w:rPr>
+              <w:t>by</w:t>
+            </w:r>
+            <w:r>
+              <w:rPr>
+                <w:b/>
+                <w:spacing w:val="-2"/>
+              </w:rPr>
+              <w:t xml:space="preserve"> </w:t>
+            </w:r>
+            <w:r>
+              <w:rPr>
+                <w:b/>
+                <w:spacing w:val="-2"/>
+              </w:rPr>
+              <w:t>any</w:t>
+            </w:r>
+            <w:r>
+              <w:rPr>
+                <w:b/>
+                <w:spacing w:val="-2"/>
+              </w:rPr>
+              <w:t xml:space="preserve"> </w:t>
+            </w:r>
+            <w:r>
+              <w:rPr>
+                <w:b/>
+                <w:spacing w:val="-2"/>
+              </w:rPr>
+              <w:t>other</w:t>
+            </w:r>
+            <w:r>
+              <w:rPr>
+                <w:b/>
+                <w:spacing w:val="-2"/>
+              </w:rPr>
+              <w:t xml:space="preserve"> </w:t>
+            </w:r>
+            <w:r>
+              <w:rPr>
+                <w:b/>
+                <w:spacing w:val="-2"/>
+              </w:rPr>
+              <w:t>interested</w:t>
+            </w:r>
+            <w:r>
+              <w:rPr>
+                <w:b/>
+                <w:spacing w:val="-2"/>
+              </w:rPr>
+              <w:t xml:space="preserve"> </w:t>
+            </w:r>
+            <w:r>
+              <w:rPr>
+                <w:b/>
+                <w:spacing w:val="-2"/>
+              </w:rPr>
+              <w:t>person</w:t>
             </w:r>
           </w:p>
           <w:p>
@@ -1349,6 +1718,9 @@
                 <w:tab w:val="left" w:pos="8398"/>
               </w:tabs>
               <w:spacing w:line="266" w:lineRule="exact"/>
+              <w:rPr>
+                <w:spacing w:val="-2"/>
+              </w:rPr>
             </w:pPr>
             <w:r>
               <w:rPr>
@@ -1440,7 +1812,7 @@
                 </mc:Choice>
                 <mc:Fallback>
                   <w:pict>
-                    <v:group w14:anchorId="391FB25C" id="Group 9" o:spid="_x0000_s1026" style="position:absolute;margin-left:23.5pt;margin-top:-1.6pt;width:422.1pt;height:.7pt;z-index:-15776768;mso-wrap-distance-left:0;mso-wrap-distance-right:0" coordsize="53606,88" o:gfxdata="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">
+                    <v:group w14:anchorId="7B33D7A8" id="Group 9" o:spid="_x0000_s1026" style="position:absolute;margin-left:23.5pt;margin-top:-1.6pt;width:422.1pt;height:.7pt;z-index:-15776768;mso-wrap-distance-left:0;mso-wrap-distance-right:0" coordsize="53606,88" o:gfxdata="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">
                       <v:shape id="Graphic 10" o:spid="_x0000_s1027" style="position:absolute;width:53606;height:88;visibility:visible;mso-wrap-style:square;v-text-anchor:top" coordsize="5360670,8890" o:gfxdata="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" path="m5360670,l,,,8889r5360670,l5360670,xe" fillcolor="black" stroked="f">
                         <v:path arrowok="t"/>
                       </v:shape>
@@ -1453,27 +1825,158 @@
               <w:rPr>
                 <w:spacing w:val="-2"/>
               </w:rPr>
-              <w:t>I/Wetheinterestedpersonrequestfortheexaminationoftheapplicationno</w:t>
-            </w:r>
-            <w:r>
-              <w:tab/>
-            </w:r>
-            <w:r>
-              <w:rPr>
-                <w:spacing w:val="-2"/>
-              </w:rPr>
-              <w:t>dated</w:t>
-            </w:r>
-          </w:p>
-          <w:p>
-            <w:pPr>
-              <w:pStyle w:val="TableParagraph"/>
-              <w:tabs>
-                <w:tab w:val="left" w:pos="1623"/>
-                <w:tab w:val="left" w:pos="5084"/>
-              </w:tabs>
-              <w:ind w:left="1623" w:right="3450" w:hanging="1148"/>
-            </w:pPr>
+              <w:t>I/We</w:t>
+            </w:r>
+            <w:r>
+              <w:rPr>
+                <w:spacing w:val="-2"/>
+              </w:rPr>
+              <w:t xml:space="preserve"> </w:t>
+            </w:r>
+            <w:r>
+              <w:rPr>
+                <w:spacing w:val="-2"/>
+              </w:rPr>
+              <w:t>the</w:t>
+            </w:r>
+            <w:r>
+              <w:rPr>
+                <w:spacing w:val="-2"/>
+              </w:rPr>
+              <w:t xml:space="preserve"> </w:t>
+            </w:r>
+            <w:r>
+              <w:rPr>
+                <w:spacing w:val="-2"/>
+              </w:rPr>
+              <w:t>interested</w:t>
+            </w:r>
+            <w:r>
+              <w:rPr>
+                <w:spacing w:val="-2"/>
+              </w:rPr>
+              <w:t xml:space="preserve"> </w:t>
+            </w:r>
+            <w:r>
+              <w:rPr>
+                <w:spacing w:val="-2"/>
+              </w:rPr>
+              <w:t>person</w:t>
+            </w:r>
+            <w:r>
+              <w:rPr>
+                <w:spacing w:val="-2"/>
+              </w:rPr>
+              <w:t xml:space="preserve"> </w:t>
+            </w:r>
+            <w:r>
+              <w:rPr>
+                <w:spacing w:val="-2"/>
+              </w:rPr>
+              <w:t>request</w:t>
+            </w:r>
+            <w:r>
+              <w:rPr>
+                <w:spacing w:val="-2"/>
+              </w:rPr>
+              <w:t xml:space="preserve"> </w:t>
+            </w:r>
+            <w:r>
+              <w:rPr>
+                <w:spacing w:val="-2"/>
+              </w:rPr>
+              <w:t>for</w:t>
+            </w:r>
+            <w:r>
+              <w:rPr>
+                <w:spacing w:val="-2"/>
+              </w:rPr>
+              <w:t xml:space="preserve"> </w:t>
+            </w:r>
+            <w:r>
+              <w:rPr>
+                <w:spacing w:val="-2"/>
+              </w:rPr>
+              <w:t>the</w:t>
+            </w:r>
+            <w:r>
+              <w:rPr>
+                <w:spacing w:val="-2"/>
+              </w:rPr>
+              <w:t xml:space="preserve"> </w:t>
+            </w:r>
+            <w:r>
+              <w:rPr>
+                <w:spacing w:val="-2"/>
+              </w:rPr>
+              <w:t>examination</w:t>
+            </w:r>
+            <w:r>
+              <w:rPr>
+                <w:spacing w:val="-2"/>
+              </w:rPr>
+              <w:t xml:space="preserve"> </w:t>
+            </w:r>
+            <w:r>
+              <w:rPr>
+                <w:spacing w:val="-2"/>
+              </w:rPr>
+              <w:t>of</w:t>
+            </w:r>
+            <w:r>
+              <w:rPr>
+                <w:spacing w:val="-2"/>
+              </w:rPr>
+              <w:t xml:space="preserve"> </w:t>
+            </w:r>
+            <w:r>
+              <w:rPr>
+                <w:spacing w:val="-2"/>
+              </w:rPr>
+              <w:t>the</w:t>
+            </w:r>
+            <w:r>
+              <w:rPr>
+                <w:spacing w:val="-2"/>
+              </w:rPr>
+              <w:t xml:space="preserve"> </w:t>
+            </w:r>
+            <w:r>
+              <w:rPr>
+                <w:spacing w:val="-2"/>
+              </w:rPr>
+              <w:t>application</w:t>
+            </w:r>
+            <w:r>
+              <w:rPr>
+                <w:spacing w:val="-2"/>
+              </w:rPr>
+              <w:t xml:space="preserve"> </w:t>
+            </w:r>
+            <w:r>
+              <w:rPr>
+                <w:spacing w:val="-2"/>
+              </w:rPr>
+              <w:t>no</w:t>
+            </w:r>
+            <w:r>
+              <w:rPr>
+                <w:spacing w:val="-2"/>
+              </w:rPr>
+              <w:t xml:space="preserve"> </w:t>
+            </w:r>
+            <w:r>
+              <w:rPr>
+                <w:spacing w:val="-2"/>
+              </w:rPr>
+              <w:t>date</w:t>
+            </w:r>
+            <w:r>
+              <w:rPr>
+                <w:spacing w:val="-2"/>
+              </w:rPr>
+              <w:t>d</w:t>
+            </w:r>
             <w:r>
               <w:rPr>
                 <w:noProof/>
@@ -1610,7 +2113,7 @@
                 </mc:Choice>
                 <mc:Fallback>
                   <w:pict>
-                    <v:group w14:anchorId="2AE288B4" id="Group 11" o:spid="_x0000_s1026" style="position:absolute;margin-left:23.5pt;margin-top:-1.55pt;width:422.1pt;height:.9pt;z-index:-15776256;mso-wrap-distance-left:0;mso-wrap-distance-right:0" coordsize="53606,114" o:gfxdata="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">
+                    <v:group w14:anchorId="3ED2A89D" id="Group 11" o:spid="_x0000_s1026" style="position:absolute;margin-left:23.5pt;margin-top:-1.55pt;width:422.1pt;height:.9pt;z-index:-15776256;mso-wrap-distance-left:0;mso-wrap-distance-right:0" coordsize="53606,114" o:gfxdata="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">
                       <v:shape id="Graphic 12" o:spid="_x0000_s1027" style="position:absolute;top:22;width:53606;height:89;visibility:visible;mso-wrap-style:square;v-text-anchor:top" coordsize="5360670,8890" o:gfxdata="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" path="m5360670,l,,,8889r5360670,l5360670,xe" fillcolor="black" stroked="f">
                         <v:path arrowok="t"/>
                       </v:shape>
@@ -1624,23 +2127,57 @@
             </w:r>
             <w:r>
               <w:rPr>
-                <w:u w:val="single"/>
-              </w:rPr>
-              <w:tab/>
-            </w:r>
-            <w:proofErr w:type="spellStart"/>
-            <w:r>
-              <w:rPr>
-                <w:spacing w:val="-2"/>
-              </w:rPr>
-              <w:t>filedbytheapplicant</w:t>
-            </w:r>
-            <w:proofErr w:type="spellEnd"/>
-            <w:r>
-              <w:rPr>
-                <w:u w:val="single"/>
-              </w:rPr>
-              <w:tab/>
+                <w:spacing w:val="-2"/>
+              </w:rPr>
+              <w:t xml:space="preserve"> </w:t>
+            </w:r>
+            <w:r>
+              <w:rPr>
+                <w:spacing w:val="-2"/>
+              </w:rPr>
+              <w:t>filed</w:t>
+            </w:r>
+            <w:r>
+              <w:rPr>
+                <w:spacing w:val="-2"/>
+              </w:rPr>
+              <w:t xml:space="preserve"> </w:t>
+            </w:r>
+            <w:r>
+              <w:rPr>
+                <w:spacing w:val="-2"/>
+              </w:rPr>
+              <w:t>by</w:t>
+            </w:r>
+            <w:r>
+              <w:rPr>
+                <w:spacing w:val="-2"/>
+              </w:rPr>
+              <w:t xml:space="preserve"> </w:t>
+            </w:r>
+            <w:r>
+              <w:rPr>
+                <w:spacing w:val="-2"/>
+              </w:rPr>
+              <w:t>the</w:t>
+            </w:r>
+            <w:r>
+              <w:rPr>
+                <w:spacing w:val="-2"/>
+              </w:rPr>
+              <w:t xml:space="preserve"> </w:t>
+            </w:r>
+            <w:r>
+              <w:rPr>
+                <w:spacing w:val="-2"/>
+              </w:rPr>
+              <w:t>applicant</w:t>
+            </w:r>
+            <w:r>
+              <w:rPr>
+                <w:spacing w:val="-2"/>
+              </w:rPr>
+              <w:t xml:space="preserve"> </w:t>
             </w:r>
             <w:r>
               <w:rPr>
@@ -1652,16 +2189,8 @@
               <w:t>under</w:t>
             </w:r>
             <w:r>
-              <w:rPr>
-                <w:strike/>
-              </w:rPr>
-              <w:t>sections12 and13ofthe Act.</w:t>
-            </w:r>
-          </w:p>
-          <w:p>
-            <w:pPr>
-              <w:pStyle w:val="TableParagraph"/>
-            </w:pPr>
+              <w:t>sections12 and 13 of the Act</w:t>
+            </w:r>
             <w:r>
               <w:rPr>
                 <w:noProof/>
@@ -1798,7 +2327,7 @@
                 </mc:Choice>
                 <mc:Fallback>
                   <w:pict>
-                    <v:group w14:anchorId="7C46BED2" id="Group 14" o:spid="_x0000_s1026" style="position:absolute;margin-left:23.5pt;margin-top:-1.75pt;width:422.1pt;height:1.15pt;z-index:-15775744;mso-wrap-distance-left:0;mso-wrap-distance-right:0" coordsize="53606,146" o:gfxdata="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">
+                    <v:group w14:anchorId="1F0A5384" id="Group 14" o:spid="_x0000_s1026" style="position:absolute;margin-left:23.5pt;margin-top:-1.75pt;width:422.1pt;height:1.15pt;z-index:-15775744;mso-wrap-distance-left:0;mso-wrap-distance-right:0" coordsize="53606,146" o:gfxdata="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">
                       <v:shape id="Graphic 15" o:spid="_x0000_s1027" style="position:absolute;top:53;width:53606;height:89;visibility:visible;mso-wrap-style:square;v-text-anchor:top" coordsize="5360670,8890" o:gfxdata="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" path="m5360670,l,,,8890r5360670,l5360670,xe" fillcolor="black" stroked="f">
                         <v:path arrowok="t"/>
                       </v:shape>
@@ -1811,25 +2340,196 @@
               </mc:AlternateContent>
             </w:r>
             <w:r>
-              <w:rPr>
-                <w:spacing w:val="-2"/>
-              </w:rPr>
-              <w:t>Asanevidenceofmy/ourinterestintheapplicationforthepatentfollowingdocumentsare</w:t>
-            </w:r>
-            <w:r>
-              <w:rPr>
-                <w:strike/>
-                <w:spacing w:val="-2"/>
-              </w:rPr>
-              <w:t>submitted.</w:t>
+              <w:t xml:space="preserve"> </w:t>
+            </w:r>
+            <w:r>
+              <w:rPr>
+                <w:spacing w:val="-2"/>
+              </w:rPr>
+              <w:t>As</w:t>
+            </w:r>
+            <w:r>
+              <w:rPr>
+                <w:spacing w:val="-2"/>
+              </w:rPr>
+              <w:t xml:space="preserve"> </w:t>
+            </w:r>
+            <w:r>
+              <w:rPr>
+                <w:spacing w:val="-2"/>
+              </w:rPr>
+              <w:t>an</w:t>
+            </w:r>
+            <w:r>
+              <w:rPr>
+                <w:spacing w:val="-2"/>
+              </w:rPr>
+              <w:t xml:space="preserve"> </w:t>
+            </w:r>
+            <w:r>
+              <w:rPr>
+                <w:spacing w:val="-2"/>
+              </w:rPr>
+              <w:t>evidence</w:t>
+            </w:r>
+            <w:r>
+              <w:rPr>
+                <w:spacing w:val="-2"/>
+              </w:rPr>
+              <w:t xml:space="preserve"> </w:t>
+            </w:r>
+            <w:r>
+              <w:rPr>
+                <w:spacing w:val="-2"/>
+              </w:rPr>
+              <w:t>of</w:t>
+            </w:r>
+            <w:r>
+              <w:rPr>
+                <w:spacing w:val="-2"/>
+              </w:rPr>
+              <w:t xml:space="preserve"> </w:t>
+            </w:r>
+            <w:r>
+              <w:rPr>
+                <w:spacing w:val="-2"/>
+              </w:rPr>
+              <w:t>my/our</w:t>
+            </w:r>
+            <w:r>
+              <w:rPr>
+                <w:spacing w:val="-2"/>
+              </w:rPr>
+              <w:t xml:space="preserve"> </w:t>
+            </w:r>
+            <w:r>
+              <w:rPr>
+                <w:spacing w:val="-2"/>
+              </w:rPr>
+              <w:t>interest</w:t>
+            </w:r>
+            <w:r>
+              <w:rPr>
+                <w:spacing w:val="-2"/>
+              </w:rPr>
+              <w:t xml:space="preserve"> </w:t>
+            </w:r>
+            <w:r>
+              <w:rPr>
+                <w:spacing w:val="-2"/>
+              </w:rPr>
+              <w:t>in</w:t>
+            </w:r>
+            <w:r>
+              <w:rPr>
+                <w:spacing w:val="-2"/>
+              </w:rPr>
+              <w:t xml:space="preserve"> </w:t>
+            </w:r>
+            <w:r>
+              <w:rPr>
+                <w:spacing w:val="-2"/>
+              </w:rPr>
+              <w:t>the</w:t>
+            </w:r>
+            <w:r>
+              <w:rPr>
+                <w:spacing w:val="-2"/>
+              </w:rPr>
+              <w:t xml:space="preserve"> </w:t>
+            </w:r>
+            <w:r>
+              <w:rPr>
+                <w:spacing w:val="-2"/>
+              </w:rPr>
+              <w:t>application</w:t>
+            </w:r>
+            <w:r>
+              <w:rPr>
+                <w:spacing w:val="-2"/>
+              </w:rPr>
+              <w:t xml:space="preserve"> </w:t>
+            </w:r>
+            <w:r>
+              <w:rPr>
+                <w:spacing w:val="-2"/>
+              </w:rPr>
+              <w:t>for</w:t>
+            </w:r>
+            <w:r>
+              <w:rPr>
+                <w:spacing w:val="-2"/>
+              </w:rPr>
+              <w:t xml:space="preserve"> </w:t>
+            </w:r>
+            <w:r>
+              <w:rPr>
+                <w:spacing w:val="-2"/>
+              </w:rPr>
+              <w:t>the</w:t>
+            </w:r>
+            <w:r>
+              <w:rPr>
+                <w:spacing w:val="-2"/>
+              </w:rPr>
+              <w:t xml:space="preserve"> </w:t>
+            </w:r>
+            <w:r>
+              <w:rPr>
+                <w:spacing w:val="-2"/>
+              </w:rPr>
+              <w:t>patent</w:t>
+            </w:r>
+            <w:r>
+              <w:rPr>
+                <w:spacing w:val="-2"/>
+              </w:rPr>
+              <w:t xml:space="preserve"> </w:t>
+            </w:r>
+            <w:r>
+              <w:rPr>
+                <w:spacing w:val="-2"/>
+              </w:rPr>
+              <w:t>following</w:t>
+            </w:r>
+            <w:r>
+              <w:rPr>
+                <w:spacing w:val="-2"/>
+              </w:rPr>
+              <w:t xml:space="preserve"> </w:t>
+            </w:r>
+            <w:r>
+              <w:rPr>
+                <w:spacing w:val="-2"/>
+              </w:rPr>
+              <w:t>documents</w:t>
+            </w:r>
+            <w:r>
+              <w:rPr>
+                <w:spacing w:val="-2"/>
+              </w:rPr>
+              <w:t xml:space="preserve"> </w:t>
+            </w:r>
+            <w:r>
+              <w:rPr>
+                <w:spacing w:val="-2"/>
+              </w:rPr>
+              <w:t>are</w:t>
+            </w:r>
+            <w:r>
+              <w:rPr>
+                <w:spacing w:val="-2"/>
+              </w:rPr>
+              <w:t xml:space="preserve"> submitted </w:t>
             </w:r>
           </w:p>
           <w:p>
             <w:pPr>
               <w:pStyle w:val="TableParagraph"/>
               <w:tabs>
-                <w:tab w:val="left" w:pos="4698"/>
+                <w:tab w:val="left" w:pos="8398"/>
               </w:tabs>
+              <w:spacing w:line="266" w:lineRule="exact"/>
             </w:pPr>
             <w:r>
               <w:rPr>
@@ -1914,7 +2614,7 @@
                 </mc:Choice>
                 <mc:Fallback>
                   <w:pict>
-                    <v:group w14:anchorId="17C54355" id="Group 17" o:spid="_x0000_s1026" style="position:absolute;margin-left:23.5pt;margin-top:29.55pt;width:202.65pt;height:.75pt;z-index:-15775232;mso-wrap-distance-left:0;mso-wrap-distance-right:0" coordsize="25736,95" o:gfxdata="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">
+                    <v:group w14:anchorId="7BA3F1BA" id="Group 17" o:spid="_x0000_s1026" style="position:absolute;margin-left:23.5pt;margin-top:29.55pt;width:202.65pt;height:.75pt;z-index:-15775232;mso-wrap-distance-left:0;mso-wrap-distance-right:0" coordsize="25736,95" o:gfxdata="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">
                       <v:shape id="Graphic 18" o:spid="_x0000_s1027" style="position:absolute;top:45;width:25736;height:13;visibility:visible;mso-wrap-style:square;v-text-anchor:top" coordsize="2573655,1270" o:gfxdata="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" path="m,l2573654,e" filled="f" strokeweight=".25317mm">
                         <v:path arrowok="t"/>
                       </v:shape>
@@ -1991,28 +2691,74 @@
               <w:rPr>
                 <w:i/>
               </w:rPr>
-              <w:t>Datedthis18</w:t>
+              <w:t>Dated</w:t>
             </w:r>
             <w:r>
               <w:rPr>
                 <w:i/>
-                <w:spacing w:val="-13"/>
-              </w:rPr>
-              <w:t xml:space="preserve"> </w:t>
-            </w:r>
-            <w:proofErr w:type="spellStart"/>
+              </w:rPr>
+              <w:t xml:space="preserve"> </w:t>
+            </w:r>
             <w:r>
               <w:rPr>
                 <w:i/>
               </w:rPr>
-              <w:t>thdayofOctober</w:t>
-            </w:r>
-            <w:proofErr w:type="spellEnd"/>
+              <w:t>this</w:t>
+            </w:r>
             <w:r>
               <w:rPr>
                 <w:i/>
               </w:rPr>
               <w:t xml:space="preserve"> </w:t>
+            </w:r>
+            <w:r>
+              <w:rPr>
+                <w:i/>
+              </w:rPr>
+              <w:t>18</w:t>
+            </w:r>
+            <w:r>
+              <w:rPr>
+                <w:i/>
+                <w:vertAlign w:val="superscript"/>
+              </w:rPr>
+              <w:t>th</w:t>
+            </w:r>
+            <w:r>
+              <w:rPr>
+                <w:i/>
+              </w:rPr>
+              <w:t xml:space="preserve"> </w:t>
+            </w:r>
+            <w:r>
+              <w:rPr>
+                <w:i/>
+              </w:rPr>
+              <w:t>day</w:t>
+            </w:r>
+            <w:r>
+              <w:rPr>
+                <w:i/>
+              </w:rPr>
+              <w:t xml:space="preserve"> </w:t>
+            </w:r>
+            <w:r>
+              <w:rPr>
+                <w:i/>
+              </w:rPr>
+              <w:t>of</w:t>
+            </w:r>
+            <w:r>
+              <w:rPr>
+                <w:i/>
+              </w:rPr>
+              <w:t xml:space="preserve"> </w:t>
+            </w:r>
+            <w:r>
+              <w:rPr>
+                <w:i/>
+              </w:rPr>
+              <w:t xml:space="preserve">October </w:t>
             </w:r>
             <w:r>
               <w:rPr>
@@ -2027,21 +2773,63 @@
               <w:pStyle w:val="TableParagraph"/>
               <w:spacing w:before="44" w:line="538" w:lineRule="exact"/>
               <w:ind w:left="3870" w:right="2638" w:firstLine="221"/>
+              <w:rPr>
+                <w:spacing w:val="-2"/>
+              </w:rPr>
             </w:pPr>
-            <w:r>
-              <w:rPr>
-                <w:spacing w:val="-2"/>
-              </w:rPr>
-              <w:t xml:space="preserve">Signature </w:t>
-            </w:r>
-            <w:proofErr w:type="spellStart"/>
-            <w:r>
-              <w:rPr>
-                <w:spacing w:val="-2"/>
-              </w:rPr>
-              <w:t>Nameofthesignatory</w:t>
-            </w:r>
-            <w:proofErr w:type="spellEnd"/>
+          </w:p>
+          <w:p>
+            <w:pPr>
+              <w:pStyle w:val="TableParagraph"/>
+              <w:spacing w:before="44" w:line="538" w:lineRule="exact"/>
+              <w:ind w:right="2638" w:firstLine="2159"/>
+              <w:jc w:val="center"/>
+              <w:rPr>
+                <w:spacing w:val="-2"/>
+              </w:rPr>
+            </w:pPr>
+            <w:r>
+              <w:rPr>
+                <w:spacing w:val="-2"/>
+              </w:rPr>
+              <w:t>Signature Name</w:t>
+            </w:r>
+            <w:r>
+              <w:rPr>
+                <w:spacing w:val="-2"/>
+              </w:rPr>
+              <w:t xml:space="preserve"> </w:t>
+            </w:r>
+            <w:r>
+              <w:rPr>
+                <w:spacing w:val="-2"/>
+              </w:rPr>
+              <w:t>of</w:t>
+            </w:r>
+            <w:r>
+              <w:rPr>
+                <w:spacing w:val="-2"/>
+              </w:rPr>
+              <w:t xml:space="preserve"> </w:t>
+            </w:r>
+            <w:r>
+              <w:rPr>
+                <w:spacing w:val="-2"/>
+              </w:rPr>
+              <w:t>the</w:t>
+            </w:r>
+            <w:r>
+              <w:rPr>
+                <w:spacing w:val="-2"/>
+              </w:rPr>
+              <w:t xml:space="preserve"> </w:t>
+            </w:r>
+            <w:r>
+              <w:rPr>
+                <w:spacing w:val="-2"/>
+              </w:rPr>
+              <w:t>signatory</w:t>
+            </w:r>
           </w:p>
           <w:p>
             <w:pPr>
@@ -2050,15 +2838,49 @@
               <w:ind w:left="196"/>
             </w:pPr>
             <w:proofErr w:type="spellStart"/>
-            <w:proofErr w:type="gramStart"/>
-            <w:r>
-              <w:rPr>
-                <w:spacing w:val="-2"/>
-              </w:rPr>
-              <w:t>To,TheControllerofPatent</w:t>
+            <w:r>
+              <w:rPr>
+                <w:spacing w:val="-2"/>
+              </w:rPr>
+              <w:t>To,The</w:t>
             </w:r>
             <w:proofErr w:type="spellEnd"/>
-            <w:proofErr w:type="gramEnd"/>
+            <w:r>
+              <w:rPr>
+                <w:spacing w:val="-2"/>
+              </w:rPr>
+              <w:t xml:space="preserve"> </w:t>
+            </w:r>
+            <w:r>
+              <w:rPr>
+                <w:spacing w:val="-2"/>
+              </w:rPr>
+              <w:t>Controller</w:t>
+            </w:r>
+            <w:r>
+              <w:rPr>
+                <w:spacing w:val="-2"/>
+              </w:rPr>
+              <w:t xml:space="preserve"> </w:t>
+            </w:r>
+            <w:r>
+              <w:rPr>
+                <w:spacing w:val="-2"/>
+              </w:rPr>
+              <w:t>of</w:t>
+            </w:r>
+            <w:r>
+              <w:rPr>
+                <w:spacing w:val="-2"/>
+              </w:rPr>
+              <w:t xml:space="preserve"> </w:t>
+            </w:r>
+            <w:r>
+              <w:rPr>
+                <w:spacing w:val="-2"/>
+              </w:rPr>
+              <w:t>Patent</w:t>
+            </w:r>
           </w:p>
           <w:p>
             <w:pPr>
@@ -2066,13 +2888,43 @@
               <w:spacing w:before="1" w:line="247" w:lineRule="exact"/>
               <w:ind w:left="504"/>
             </w:pPr>
+            <w:r>
+              <w:rPr>
+                <w:spacing w:val="-2"/>
+              </w:rPr>
+              <w:t>The</w:t>
+            </w:r>
+            <w:r>
+              <w:rPr>
+                <w:spacing w:val="-2"/>
+              </w:rPr>
+              <w:t xml:space="preserve"> </w:t>
+            </w:r>
+            <w:r>
+              <w:rPr>
+                <w:spacing w:val="-2"/>
+              </w:rPr>
+              <w:t>Patent</w:t>
+            </w:r>
+            <w:r>
+              <w:rPr>
+                <w:spacing w:val="-2"/>
+              </w:rPr>
+              <w:t xml:space="preserve"> </w:t>
+            </w:r>
             <w:proofErr w:type="spellStart"/>
-            <w:proofErr w:type="gramStart"/>
-            <w:r>
-              <w:rPr>
-                <w:spacing w:val="-2"/>
-              </w:rPr>
-              <w:t>ThePatentOffice,at</w:t>
+            <w:r>
+              <w:rPr>
+                <w:spacing w:val="-2"/>
+              </w:rPr>
+              <w:t>Office,at</w:t>
+            </w:r>
+            <w:proofErr w:type="spellEnd"/>
+            <w:r>
+              <w:rPr>
+                <w:spacing w:val="-2"/>
+              </w:rPr>
+              <w:t xml:space="preserve"> </w:t>
             </w:r>
             <w:r>
               <w:rPr>
@@ -2081,8 +2933,6 @@
               </w:rPr>
               <w:t>Chennai</w:t>
             </w:r>
-            <w:proofErr w:type="spellEnd"/>
-            <w:proofErr w:type="gramEnd"/>
           </w:p>
         </w:tc>
       </w:tr>
@@ -2126,7 +2976,175 @@
                 <w:b/>
                 <w:spacing w:val="-2"/>
               </w:rPr>
-              <w:t>*Tobesignedbytheapplicant(s)orbyhisauthorizedregisteredpatentagent</w:t>
+              <w:t>*To</w:t>
+            </w:r>
+            <w:r>
+              <w:rPr>
+                <w:b/>
+                <w:spacing w:val="-2"/>
+              </w:rPr>
+              <w:t xml:space="preserve"> </w:t>
+            </w:r>
+            <w:r>
+              <w:rPr>
+                <w:b/>
+                <w:spacing w:val="-2"/>
+              </w:rPr>
+              <w:t>be</w:t>
+            </w:r>
+            <w:r>
+              <w:rPr>
+                <w:b/>
+                <w:spacing w:val="-2"/>
+              </w:rPr>
+              <w:t xml:space="preserve"> </w:t>
+            </w:r>
+            <w:r>
+              <w:rPr>
+                <w:b/>
+                <w:spacing w:val="-2"/>
+              </w:rPr>
+              <w:t>signed</w:t>
+            </w:r>
+            <w:r>
+              <w:rPr>
+                <w:b/>
+                <w:spacing w:val="-2"/>
+              </w:rPr>
+              <w:t xml:space="preserve"> </w:t>
+            </w:r>
+            <w:r>
+              <w:rPr>
+                <w:b/>
+                <w:spacing w:val="-2"/>
+              </w:rPr>
+              <w:t>by</w:t>
+            </w:r>
+            <w:r>
+              <w:rPr>
+                <w:b/>
+                <w:spacing w:val="-2"/>
+              </w:rPr>
+              <w:t xml:space="preserve"> </w:t>
+            </w:r>
+            <w:r>
+              <w:rPr>
+                <w:b/>
+                <w:spacing w:val="-2"/>
+              </w:rPr>
+              <w:t>the</w:t>
+            </w:r>
+            <w:r>
+              <w:rPr>
+                <w:b/>
+                <w:spacing w:val="-2"/>
+              </w:rPr>
+              <w:t xml:space="preserve"> </w:t>
+            </w:r>
+            <w:r>
+              <w:rPr>
+                <w:b/>
+                <w:spacing w:val="-2"/>
+              </w:rPr>
+              <w:t>applicant(s)</w:t>
+            </w:r>
+            <w:r>
+              <w:rPr>
+                <w:b/>
+                <w:spacing w:val="-2"/>
+              </w:rPr>
+              <w:t xml:space="preserve"> </w:t>
+            </w:r>
+            <w:r>
+              <w:rPr>
+                <w:b/>
+                <w:spacing w:val="-2"/>
+              </w:rPr>
+              <w:t>or</w:t>
+            </w:r>
+            <w:r>
+              <w:rPr>
+                <w:b/>
+                <w:spacing w:val="-2"/>
+              </w:rPr>
+              <w:t xml:space="preserve"> </w:t>
+            </w:r>
+            <w:r>
+              <w:rPr>
+                <w:b/>
+                <w:spacing w:val="-2"/>
+              </w:rPr>
+              <w:t>by</w:t>
+            </w:r>
+            <w:r>
+              <w:rPr>
+                <w:b/>
+                <w:spacing w:val="-2"/>
+              </w:rPr>
+              <w:t xml:space="preserve"> </w:t>
+            </w:r>
+            <w:r>
+              <w:rPr>
+                <w:b/>
+                <w:spacing w:val="-2"/>
+              </w:rPr>
+              <w:t>his</w:t>
+            </w:r>
+            <w:r>
+              <w:rPr>
+                <w:b/>
+                <w:spacing w:val="-2"/>
+              </w:rPr>
+              <w:t xml:space="preserve"> </w:t>
+            </w:r>
+            <w:r>
+              <w:rPr>
+                <w:b/>
+                <w:spacing w:val="-2"/>
+              </w:rPr>
+              <w:t>authorized</w:t>
+            </w:r>
+            <w:r>
+              <w:rPr>
+                <w:b/>
+                <w:spacing w:val="-2"/>
+              </w:rPr>
+              <w:t xml:space="preserve"> </w:t>
+            </w:r>
+            <w:r>
+              <w:rPr>
+                <w:b/>
+                <w:spacing w:val="-2"/>
+              </w:rPr>
+              <w:t>registered</w:t>
+            </w:r>
+            <w:r>
+              <w:rPr>
+                <w:b/>
+                <w:spacing w:val="-2"/>
+              </w:rPr>
+              <w:t xml:space="preserve"> </w:t>
+            </w:r>
+            <w:r>
+              <w:rPr>
+                <w:b/>
+                <w:spacing w:val="-2"/>
+              </w:rPr>
+              <w:t>patent</w:t>
+            </w:r>
+            <w:r>
+              <w:rPr>
+                <w:b/>
+                <w:spacing w:val="-2"/>
+              </w:rPr>
+              <w:t xml:space="preserve"> </w:t>
+            </w:r>
+            <w:r>
+              <w:rPr>
+                <w:b/>
+                <w:spacing w:val="-2"/>
+              </w:rPr>
+              <w:t>agent</w:t>
             </w:r>
           </w:p>
           <w:p>
@@ -2143,33 +3161,106 @@
                 <w:b/>
                 <w:spacing w:val="-2"/>
               </w:rPr>
-              <w:t>*</w:t>
-            </w:r>
-            <w:proofErr w:type="spellStart"/>
-            <w:r>
-              <w:rPr>
-                <w:b/>
-                <w:spacing w:val="-2"/>
-              </w:rPr>
-              <w:t>Strikeoutthecolumnwhichis</w:t>
-            </w:r>
-            <w:proofErr w:type="spellEnd"/>
-            <w:r>
-              <w:rPr>
-                <w:b/>
-                <w:spacing w:val="-2"/>
-              </w:rPr>
-              <w:t>/</w:t>
-            </w:r>
-            <w:proofErr w:type="spellStart"/>
-            <w:r>
-              <w:rPr>
-                <w:b/>
-                <w:spacing w:val="-2"/>
-              </w:rPr>
-              <w:t>arenotapplicable</w:t>
-            </w:r>
-            <w:proofErr w:type="spellEnd"/>
+              <w:t>*Strike</w:t>
+            </w:r>
+            <w:r>
+              <w:rPr>
+                <w:b/>
+                <w:spacing w:val="-2"/>
+              </w:rPr>
+              <w:t xml:space="preserve"> </w:t>
+            </w:r>
+            <w:r>
+              <w:rPr>
+                <w:b/>
+                <w:spacing w:val="-2"/>
+              </w:rPr>
+              <w:t>out</w:t>
+            </w:r>
+            <w:r>
+              <w:rPr>
+                <w:b/>
+                <w:spacing w:val="-2"/>
+              </w:rPr>
+              <w:t xml:space="preserve"> </w:t>
+            </w:r>
+            <w:r>
+              <w:rPr>
+                <w:b/>
+                <w:spacing w:val="-2"/>
+              </w:rPr>
+              <w:t>the</w:t>
+            </w:r>
+            <w:r>
+              <w:rPr>
+                <w:b/>
+                <w:spacing w:val="-2"/>
+              </w:rPr>
+              <w:t xml:space="preserve"> </w:t>
+            </w:r>
+            <w:r>
+              <w:rPr>
+                <w:b/>
+                <w:spacing w:val="-2"/>
+              </w:rPr>
+              <w:t>column</w:t>
+            </w:r>
+            <w:r>
+              <w:rPr>
+                <w:b/>
+                <w:spacing w:val="-2"/>
+              </w:rPr>
+              <w:t xml:space="preserve"> </w:t>
+            </w:r>
+            <w:r>
+              <w:rPr>
+                <w:b/>
+                <w:spacing w:val="-2"/>
+              </w:rPr>
+              <w:t>which</w:t>
+            </w:r>
+            <w:r>
+              <w:rPr>
+                <w:b/>
+                <w:spacing w:val="-2"/>
+              </w:rPr>
+              <w:t xml:space="preserve"> </w:t>
+            </w:r>
+            <w:r>
+              <w:rPr>
+                <w:b/>
+                <w:spacing w:val="-2"/>
+              </w:rPr>
+              <w:t>is/are</w:t>
+            </w:r>
+            <w:r>
+              <w:rPr>
+                <w:b/>
+                <w:spacing w:val="-2"/>
+              </w:rPr>
+              <w:t xml:space="preserve"> </w:t>
+            </w:r>
+            <w:r>
+              <w:rPr>
+                <w:b/>
+                <w:spacing w:val="-2"/>
+              </w:rPr>
+              <w:t>not</w:t>
+            </w:r>
+            <w:r>
+              <w:rPr>
+                <w:b/>
+                <w:spacing w:val="-2"/>
+              </w:rPr>
+              <w:t xml:space="preserve"> </w:t>
+            </w:r>
+            <w:r>
+              <w:rPr>
+                <w:b/>
+                <w:spacing w:val="-2"/>
+              </w:rPr>
+              <w:t>applicable</w:t>
+            </w:r>
           </w:p>
         </w:tc>
       </w:tr>
@@ -2264,7 +3355,7 @@
           </mc:Choice>
           <mc:Fallback>
             <w:pict>
-              <v:shape w14:anchorId="3D547535" id="Graphic 19" o:spid="_x0000_s1026" style="position:absolute;margin-left:1in;margin-top:14.35pt;width:448.75pt;height:.6pt;z-index:-15774720;visibility:visible;mso-wrap-style:square;mso-wrap-distance-left:0;mso-wrap-distance-top:0;mso-wrap-distance-right:0;mso-wrap-distance-bottom:0;mso-position-horizontal:absolute;mso-position-horizontal-relative:page;mso-position-vertical:absolute;mso-position-vertical-relative:text;v-text-anchor:top" coordsize="5699125,7620" o:gfxdata="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" path="m5699125,l,,,7620r5699125,l5699125,xe" fillcolor="black" stroked="f">
+              <v:shape w14:anchorId="1DC903A9" id="Graphic 19" o:spid="_x0000_s1026" style="position:absolute;margin-left:1in;margin-top:14.35pt;width:448.75pt;height:.6pt;z-index:-15774720;visibility:visible;mso-wrap-style:square;mso-wrap-distance-left:0;mso-wrap-distance-top:0;mso-wrap-distance-right:0;mso-wrap-distance-bottom:0;mso-position-horizontal:absolute;mso-position-horizontal-relative:page;mso-position-vertical:absolute;mso-position-vertical-relative:text;v-text-anchor:top" coordsize="5699125,7620" o:gfxdata="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" path="m5699125,l,,,7620r5699125,l5699125,xe" fillcolor="black" stroked="f">
                 <v:path arrowok="t"/>
                 <w10:wrap anchorx="page"/>
               </v:shape>
@@ -2328,7 +3419,6 @@
         <w:tab/>
       </w:r>
       <w:proofErr w:type="spellStart"/>
-      <w:proofErr w:type="gramStart"/>
       <w:r>
         <w:rPr>
           <w:spacing w:val="-2"/>
@@ -2349,7 +3439,6 @@
         <w:t>असाधारण</w:t>
       </w:r>
       <w:proofErr w:type="spellEnd"/>
-      <w:proofErr w:type="gramEnd"/>
       <w:r>
         <w:rPr>
           <w:rFonts w:ascii="Times New Roman" w:eastAsia="Times New Roman" w:hAnsi="Times New Roman" w:cs="Times New Roman"/>
@@ -2922,6 +4011,7 @@
   <w:style w:type="character" w:default="1" w:styleId="DefaultParagraphFont">
     <w:name w:val="Default Paragraph Font"/>
     <w:uiPriority w:val="1"/>
+    <w:semiHidden/>
     <w:unhideWhenUsed/>
   </w:style>
   <w:style w:type="table" w:default="1" w:styleId="TableNormal">

</xml_diff>